<commit_message>
docs: añadidas secciones de errores, credenciales, CORS, permisos, verificación post-despliegue
</commit_message>
<xml_diff>
--- a/documentacion/Cambios_Despliegue_FitStock.docx
+++ b/documentacion/Cambios_Despliegue_FitStock.docx
@@ -127,7 +127,7 @@
         <w:spacing w:after="80"/>
       </w:pPr>
       <w:r>
-        <w:t>10. Archivos a subir por FTP</w:t>
+        <w:t>10. Cambio 9: Credenciales de base de datos (conexion.php)</w:t>
       </w:r>
     </w:p>
     <w:p>
@@ -135,7 +135,55 @@
         <w:spacing w:after="80"/>
       </w:pPr>
       <w:r>
-        <w:t>11. Estructura final del servidor</w:t>
+        <w:t>11. Cambio 10: Cabeceras CORS en router.php</w:t>
+      </w:r>
+    </w:p>
+    <w:p>
+      <w:pPr>
+        <w:spacing w:after="80"/>
+      </w:pPr>
+      <w:r>
+        <w:t>12. Cambio 11: CSS inline en documentación (subcarpeta)</w:t>
+      </w:r>
+    </w:p>
+    <w:p>
+      <w:pPr>
+        <w:spacing w:after="80"/>
+      </w:pPr>
+      <w:r>
+        <w:t>13. Cambio 12: Permisos de archivos en el servidor</w:t>
+      </w:r>
+    </w:p>
+    <w:p>
+      <w:pPr>
+        <w:spacing w:after="80"/>
+      </w:pPr>
+      <w:r>
+        <w:t>14. Registro de errores durante el despliegue</w:t>
+      </w:r>
+    </w:p>
+    <w:p>
+      <w:pPr>
+        <w:spacing w:after="80"/>
+      </w:pPr>
+      <w:r>
+        <w:t>15. Archivos a subir por FTP</w:t>
+      </w:r>
+    </w:p>
+    <w:p>
+      <w:pPr>
+        <w:spacing w:after="80"/>
+      </w:pPr>
+      <w:r>
+        <w:t>16. Estructura final del servidor</w:t>
+      </w:r>
+    </w:p>
+    <w:p>
+      <w:pPr>
+        <w:spacing w:after="80"/>
+      </w:pPr>
+      <w:r>
+        <w:t>17. Verificación post-despliegue</w:t>
       </w:r>
     </w:p>
     <w:p>
@@ -1038,11 +1086,1301 @@
       </w:r>
     </w:p>
     <w:p>
+      <w:r>
+        <w:br w:type="page"/>
+      </w:r>
+    </w:p>
+    <w:p>
       <w:pPr>
         <w:pStyle w:val="Heading1"/>
       </w:pPr>
       <w:r>
-        <w:t>9. Archivos a subir por FTP</w:t>
+        <w:t>9. Cambio 8: Credenciales de base de datos (conexion.php)</w:t>
+      </w:r>
+    </w:p>
+    <w:p>
+      <w:r>
+        <w:t>Se actualizó el archivo conexion.php con las credenciales de la base de datos de producción en Arsys.</w:t>
+      </w:r>
+    </w:p>
+    <w:p>
+      <w:pPr>
+        <w:pStyle w:val="Heading2"/>
+      </w:pPr>
+      <w:r>
+        <w:t>Archivo:</w:t>
+      </w:r>
+    </w:p>
+    <w:p>
+      <w:r>
+        <w:t>FitStock-API/conexion.php</w:t>
+      </w:r>
+    </w:p>
+    <w:p>
+      <w:pPr>
+        <w:pStyle w:val="Heading2"/>
+      </w:pPr>
+      <w:r>
+        <w:t>Cambios realizados:</w:t>
+      </w:r>
+    </w:p>
+    <w:tbl>
+      <w:tblPr>
+        <w:tblStyle w:val="LightShading-Accent1"/>
+        <w:tblW w:type="auto" w:w="0"/>
+        <w:jc w:val="center"/>
+        <w:tblLook w:firstColumn="1" w:firstRow="1" w:lastColumn="0" w:lastRow="0" w:noHBand="0" w:noVBand="1" w:val="04A0"/>
+      </w:tblPr>
+      <w:tblGrid>
+        <w:gridCol w:w="4320"/>
+        <w:gridCol w:w="4320"/>
+      </w:tblGrid>
+      <w:tr>
+        <w:tc>
+          <w:tcPr>
+            <w:tcW w:type="dxa" w:w="4320"/>
+          </w:tcPr>
+          <w:p>
+            <w:r>
+              <w:t>Parámetro</w:t>
+            </w:r>
+          </w:p>
+        </w:tc>
+        <w:tc>
+          <w:tcPr>
+            <w:tcW w:type="dxa" w:w="4320"/>
+          </w:tcPr>
+          <w:p>
+            <w:r>
+              <w:t>Desarrollo (local)</w:t>
+            </w:r>
+          </w:p>
+        </w:tc>
+      </w:tr>
+      <w:tr>
+        <w:tc>
+          <w:tcPr>
+            <w:tcW w:type="dxa" w:w="4320"/>
+          </w:tcPr>
+          <w:p>
+            <w:r>
+              <w:t>Servidor</w:t>
+            </w:r>
+          </w:p>
+        </w:tc>
+        <w:tc>
+          <w:tcPr>
+            <w:tcW w:type="dxa" w:w="4320"/>
+          </w:tcPr>
+          <w:p>
+            <w:r>
+              <w:t>localhost</w:t>
+            </w:r>
+          </w:p>
+        </w:tc>
+      </w:tr>
+      <w:tr>
+        <w:tc>
+          <w:tcPr>
+            <w:tcW w:type="dxa" w:w="4320"/>
+          </w:tcPr>
+          <w:p>
+            <w:r>
+              <w:t>Usuario</w:t>
+            </w:r>
+          </w:p>
+        </w:tc>
+        <w:tc>
+          <w:tcPr>
+            <w:tcW w:type="dxa" w:w="4320"/>
+          </w:tcPr>
+          <w:p>
+            <w:r>
+              <w:t>fitstock</w:t>
+            </w:r>
+          </w:p>
+        </w:tc>
+      </w:tr>
+      <w:tr>
+        <w:tc>
+          <w:tcPr>
+            <w:tcW w:type="dxa" w:w="4320"/>
+          </w:tcPr>
+          <w:p>
+            <w:r>
+              <w:t>Contraseña</w:t>
+            </w:r>
+          </w:p>
+        </w:tc>
+        <w:tc>
+          <w:tcPr>
+            <w:tcW w:type="dxa" w:w="4320"/>
+          </w:tcPr>
+          <w:p>
+            <w:r>
+              <w:t>Tokio2324</w:t>
+            </w:r>
+          </w:p>
+        </w:tc>
+      </w:tr>
+      <w:tr>
+        <w:tc>
+          <w:tcPr>
+            <w:tcW w:type="dxa" w:w="4320"/>
+          </w:tcPr>
+          <w:p>
+            <w:r>
+              <w:t>Base de datos</w:t>
+            </w:r>
+          </w:p>
+        </w:tc>
+        <w:tc>
+          <w:tcPr>
+            <w:tcW w:type="dxa" w:w="4320"/>
+          </w:tcPr>
+          <w:p>
+            <w:r>
+              <w:t>fitstock</w:t>
+            </w:r>
+          </w:p>
+        </w:tc>
+      </w:tr>
+    </w:tbl>
+    <w:tbl>
+      <w:tblPr>
+        <w:tblStyle w:val="LightShading-Accent1"/>
+        <w:tblW w:type="auto" w:w="0"/>
+        <w:jc w:val="center"/>
+        <w:tblLook w:firstColumn="1" w:firstRow="1" w:lastColumn="0" w:lastRow="0" w:noHBand="0" w:noVBand="1" w:val="04A0"/>
+      </w:tblPr>
+      <w:tblGrid>
+        <w:gridCol w:w="8640"/>
+      </w:tblGrid>
+      <w:tr>
+        <w:tc>
+          <w:tcPr>
+            <w:tcW w:type="dxa" w:w="8640"/>
+          </w:tcPr>
+          <w:p>
+            <w:r>
+              <w:t>Producción (Arsys)</w:t>
+            </w:r>
+          </w:p>
+        </w:tc>
+      </w:tr>
+    </w:tbl>
+    <w:tbl>
+      <w:tblPr>
+        <w:tblW w:type="auto" w:w="0"/>
+        <w:tblLook w:firstColumn="1" w:firstRow="1" w:lastColumn="0" w:lastRow="0" w:noHBand="0" w:noVBand="1" w:val="04A0"/>
+      </w:tblPr>
+      <w:tblGrid>
+        <w:gridCol w:w="8640"/>
+      </w:tblGrid>
+      <w:tr>
+        <w:tc>
+          <w:tcPr>
+            <w:tcW w:type="dxa" w:w="8640"/>
+          </w:tcPr>
+          <w:p/>
+        </w:tc>
+      </w:tr>
+      <w:tr>
+        <w:tc>
+          <w:tcPr>
+            <w:tcW w:type="dxa" w:w="8640"/>
+          </w:tcPr>
+          <w:p>
+            <w:r>
+              <w:t>qaqo430.chomsky.es</w:t>
+            </w:r>
+          </w:p>
+        </w:tc>
+      </w:tr>
+      <w:tr>
+        <w:tc>
+          <w:tcPr>
+            <w:tcW w:type="dxa" w:w="8640"/>
+          </w:tcPr>
+          <w:p>
+            <w:r>
+              <w:t>qaqo430</w:t>
+            </w:r>
+          </w:p>
+        </w:tc>
+      </w:tr>
+      <w:tr>
+        <w:tc>
+          <w:tcPr>
+            <w:tcW w:type="dxa" w:w="8640"/>
+          </w:tcPr>
+          <w:p>
+            <w:r>
+              <w:t>17J16a8m28g!</w:t>
+            </w:r>
+          </w:p>
+        </w:tc>
+      </w:tr>
+      <w:tr>
+        <w:tc>
+          <w:tcPr>
+            <w:tcW w:type="dxa" w:w="8640"/>
+          </w:tcPr>
+          <w:p>
+            <w:r>
+              <w:t>qaqo430</w:t>
+            </w:r>
+          </w:p>
+        </w:tc>
+      </w:tr>
+    </w:tbl>
+    <w:p/>
+    <w:tbl>
+      <w:tblPr>
+        <w:tblStyle w:val="LightShading-Accent1"/>
+        <w:tblW w:type="auto" w:w="0"/>
+        <w:jc w:val="center"/>
+        <w:tblLook w:firstColumn="1" w:firstRow="1" w:lastColumn="0" w:lastRow="0" w:noHBand="0" w:noVBand="1" w:val="04A0"/>
+      </w:tblPr>
+      <w:tblGrid>
+        <w:gridCol w:w="2880"/>
+        <w:gridCol w:w="2880"/>
+        <w:gridCol w:w="2880"/>
+      </w:tblGrid>
+      <w:tr>
+        <w:tc>
+          <w:tcPr>
+            <w:tcW w:type="dxa" w:w="2880"/>
+          </w:tcPr>
+          <w:p>
+            <w:r>
+              <w:t>Parámetro</w:t>
+            </w:r>
+          </w:p>
+        </w:tc>
+        <w:tc>
+          <w:tcPr>
+            <w:tcW w:type="dxa" w:w="2880"/>
+          </w:tcPr>
+          <w:p>
+            <w:r>
+              <w:t>Desarrollo</w:t>
+            </w:r>
+          </w:p>
+        </w:tc>
+        <w:tc>
+          <w:tcPr>
+            <w:tcW w:type="dxa" w:w="2880"/>
+          </w:tcPr>
+          <w:p>
+            <w:r>
+              <w:t>Producción</w:t>
+            </w:r>
+          </w:p>
+        </w:tc>
+      </w:tr>
+      <w:tr>
+        <w:tc>
+          <w:tcPr>
+            <w:tcW w:type="dxa" w:w="2880"/>
+          </w:tcPr>
+          <w:p>
+            <w:r>
+              <w:t>Servidor</w:t>
+            </w:r>
+          </w:p>
+        </w:tc>
+        <w:tc>
+          <w:tcPr>
+            <w:tcW w:type="dxa" w:w="2880"/>
+          </w:tcPr>
+          <w:p>
+            <w:r>
+              <w:t>localhost</w:t>
+            </w:r>
+          </w:p>
+        </w:tc>
+        <w:tc>
+          <w:tcPr>
+            <w:tcW w:type="dxa" w:w="2880"/>
+          </w:tcPr>
+          <w:p>
+            <w:r>
+              <w:t>qaqo430.chomsky.es</w:t>
+            </w:r>
+          </w:p>
+        </w:tc>
+      </w:tr>
+      <w:tr>
+        <w:tc>
+          <w:tcPr>
+            <w:tcW w:type="dxa" w:w="2880"/>
+          </w:tcPr>
+          <w:p>
+            <w:r>
+              <w:t>Usuario</w:t>
+            </w:r>
+          </w:p>
+        </w:tc>
+        <w:tc>
+          <w:tcPr>
+            <w:tcW w:type="dxa" w:w="2880"/>
+          </w:tcPr>
+          <w:p>
+            <w:r>
+              <w:t>fitstock</w:t>
+            </w:r>
+          </w:p>
+        </w:tc>
+        <w:tc>
+          <w:tcPr>
+            <w:tcW w:type="dxa" w:w="2880"/>
+          </w:tcPr>
+          <w:p>
+            <w:r>
+              <w:t>qaqo430</w:t>
+            </w:r>
+          </w:p>
+        </w:tc>
+      </w:tr>
+      <w:tr>
+        <w:tc>
+          <w:tcPr>
+            <w:tcW w:type="dxa" w:w="2880"/>
+          </w:tcPr>
+          <w:p>
+            <w:r>
+              <w:t>Contraseña</w:t>
+            </w:r>
+          </w:p>
+        </w:tc>
+        <w:tc>
+          <w:tcPr>
+            <w:tcW w:type="dxa" w:w="2880"/>
+          </w:tcPr>
+          <w:p>
+            <w:r>
+              <w:t>Tokio2324</w:t>
+            </w:r>
+          </w:p>
+        </w:tc>
+        <w:tc>
+          <w:tcPr>
+            <w:tcW w:type="dxa" w:w="2880"/>
+          </w:tcPr>
+          <w:p>
+            <w:r>
+              <w:t>17J16a8m28g!</w:t>
+            </w:r>
+          </w:p>
+        </w:tc>
+      </w:tr>
+      <w:tr>
+        <w:tc>
+          <w:tcPr>
+            <w:tcW w:type="dxa" w:w="2880"/>
+          </w:tcPr>
+          <w:p>
+            <w:r>
+              <w:t>Base de datos</w:t>
+            </w:r>
+          </w:p>
+        </w:tc>
+        <w:tc>
+          <w:tcPr>
+            <w:tcW w:type="dxa" w:w="2880"/>
+          </w:tcPr>
+          <w:p>
+            <w:r>
+              <w:t>fitstock</w:t>
+            </w:r>
+          </w:p>
+        </w:tc>
+        <w:tc>
+          <w:tcPr>
+            <w:tcW w:type="dxa" w:w="2880"/>
+          </w:tcPr>
+          <w:p>
+            <w:r>
+              <w:t>qaqo430</w:t>
+            </w:r>
+          </w:p>
+        </w:tc>
+      </w:tr>
+    </w:tbl>
+    <w:p>
+      <w:r>
+        <w:t>Este cambio es necesario porque la base de datos en Arsys tiene un nombre, usuario y servidor diferentes a los del entorno de desarrollo local.</w:t>
+      </w:r>
+    </w:p>
+    <w:p>
+      <w:r>
+        <w:br w:type="page"/>
+      </w:r>
+    </w:p>
+    <w:p>
+      <w:pPr>
+        <w:pStyle w:val="Heading1"/>
+      </w:pPr>
+      <w:r>
+        <w:t>10. Cambio 9: Cabeceras CORS en router.php</w:t>
+      </w:r>
+    </w:p>
+    <w:p>
+      <w:r>
+        <w:t>Se actualizó la cabecera Access-Control-Allow-Origin en router.php para permitir peticiones desde el dominio de producción.</w:t>
+      </w:r>
+    </w:p>
+    <w:p>
+      <w:pPr>
+        <w:pStyle w:val="Heading2"/>
+      </w:pPr>
+      <w:r>
+        <w:t>Archivo:</w:t>
+      </w:r>
+    </w:p>
+    <w:p>
+      <w:r>
+        <w:t>FitStock-API/router.php, línea 11</w:t>
+      </w:r>
+    </w:p>
+    <w:p>
+      <w:pPr>
+        <w:pStyle w:val="Heading2"/>
+      </w:pPr>
+      <w:r>
+        <w:t>Antes:</w:t>
+      </w:r>
+    </w:p>
+    <w:p>
+      <w:r>
+        <w:rPr>
+          <w:rFonts w:ascii="Consolas" w:hAnsi="Consolas"/>
+          <w:sz w:val="20"/>
+        </w:rPr>
+        <w:t>header("Access-Control-Allow-Origin: http://localhost:4200");</w:t>
+      </w:r>
+    </w:p>
+    <w:p>
+      <w:pPr>
+        <w:pStyle w:val="Heading2"/>
+      </w:pPr>
+      <w:r>
+        <w:t>Después:</w:t>
+      </w:r>
+    </w:p>
+    <w:p>
+      <w:r>
+        <w:rPr>
+          <w:rFonts w:ascii="Consolas" w:hAnsi="Consolas"/>
+          <w:sz w:val="20"/>
+        </w:rPr>
+        <w:t>header("Access-Control-Allow-Origin: https://chomsky.es");</w:t>
+      </w:r>
+    </w:p>
+    <w:p>
+      <w:r>
+        <w:t>El cambio era necesario porque el navegador bloquea las peticiones HTTP entre dominios distintos (CORS). El frontend Angular se sirve desde https://chomsky.es/API/, por lo que la API debe permitir explícitamente el acceso desde ese origen.</w:t>
+      </w:r>
+    </w:p>
+    <w:p>
+      <w:r>
+        <w:br w:type="page"/>
+      </w:r>
+    </w:p>
+    <w:p>
+      <w:pPr>
+        <w:pStyle w:val="Heading1"/>
+      </w:pPr>
+      <w:r>
+        <w:t>11. Cambio 10: CSS inline en documentación (subcarpeta)</w:t>
+      </w:r>
+    </w:p>
+    <w:p>
+      <w:r>
+        <w:t>Al alojar la aplicación en una subcarpeta /API/, las rutas relativas de los archivos CSS enlazados desde docs.html dejaron de funcionar. La solución fue incrustar el CSS directamente en el HTML.</w:t>
+      </w:r>
+    </w:p>
+    <w:p>
+      <w:pPr>
+        <w:pStyle w:val="Heading2"/>
+      </w:pPr>
+      <w:r>
+        <w:t>Archivo:</w:t>
+      </w:r>
+    </w:p>
+    <w:p>
+      <w:r>
+        <w:t>FitStock-API/docs/docs.php</w:t>
+      </w:r>
+    </w:p>
+    <w:p>
+      <w:pPr>
+        <w:pStyle w:val="Heading2"/>
+      </w:pPr>
+      <w:r>
+        <w:t>Problema:</w:t>
+      </w:r>
+    </w:p>
+    <w:p>
+      <w:r>
+        <w:t>El archivo docs.html incluía la hoja de estilos con una ruta relativa:</w:t>
+        <w:br/>
+        <w:br/>
+        <w:t xml:space="preserve">  &lt;link rel="stylesheet" href="docs/docs.css"&gt;</w:t>
+        <w:br/>
+        <w:br/>
+        <w:t>Al acceder desde https://chomsky.es/API/docs/docs.php, la ruta se resolvía correctamente. Pero al acceder desde la raíz /API/ (redirigido por el router), la ruta docs/docs.css se resolvía como /API/docs/docs.css, que también funcionaba. El problema real ocurría en ciertas configuraciones donde la ruta se rompía.</w:t>
+      </w:r>
+    </w:p>
+    <w:p>
+      <w:pPr>
+        <w:pStyle w:val="Heading2"/>
+      </w:pPr>
+      <w:r>
+        <w:t>Solución:</w:t>
+      </w:r>
+    </w:p>
+    <w:p>
+      <w:r>
+        <w:t>Se modificó docs.php para leer el contenido de docs.css con file_get_contents() e incrustarlo directamente en el HTML dentro de una etiqueta &lt;style&gt;:</w:t>
+        <w:br/>
+        <w:br/>
+        <w:t xml:space="preserve">  &lt;style&gt;</w:t>
+        <w:br/>
+        <w:t xml:space="preserve">    &lt;?php echo file_get_contents(__DIR__ . "/docs.css"); ?&gt;</w:t>
+        <w:br/>
+        <w:t xml:space="preserve">  &lt;/style&gt;</w:t>
+        <w:br/>
+        <w:br/>
+        <w:t>De esta forma, el CSS se sirve inline y no depende de rutas relativas.</w:t>
+      </w:r>
+    </w:p>
+    <w:p>
+      <w:r>
+        <w:br w:type="page"/>
+      </w:r>
+    </w:p>
+    <w:p>
+      <w:pPr>
+        <w:pStyle w:val="Heading1"/>
+      </w:pPr>
+      <w:r>
+        <w:t>12. Cambio 11: Permisos de archivos en el servidor</w:t>
+      </w:r>
+    </w:p>
+    <w:p>
+      <w:r>
+        <w:t>Para que la aplicación funcione correctamente en el servidor, fue necesario ajustar los permisos de ciertas carpetas.</w:t>
+      </w:r>
+    </w:p>
+    <w:p>
+      <w:pPr>
+        <w:pStyle w:val="Heading2"/>
+      </w:pPr>
+      <w:r>
+        <w:t>Carpeta con permisos especiales:</w:t>
+      </w:r>
+    </w:p>
+    <w:tbl>
+      <w:tblPr>
+        <w:tblStyle w:val="LightShading-Accent1"/>
+        <w:tblW w:type="auto" w:w="0"/>
+        <w:jc w:val="center"/>
+        <w:tblLook w:firstColumn="1" w:firstRow="1" w:lastColumn="0" w:lastRow="0" w:noHBand="0" w:noVBand="1" w:val="04A0"/>
+      </w:tblPr>
+      <w:tblGrid>
+        <w:gridCol w:w="2880"/>
+        <w:gridCol w:w="2880"/>
+        <w:gridCol w:w="2880"/>
+      </w:tblGrid>
+      <w:tr>
+        <w:tc>
+          <w:tcPr>
+            <w:tcW w:type="dxa" w:w="2880"/>
+          </w:tcPr>
+          <w:p>
+            <w:r>
+              <w:t>Carpeta</w:t>
+            </w:r>
+          </w:p>
+        </w:tc>
+        <w:tc>
+          <w:tcPr>
+            <w:tcW w:type="dxa" w:w="2880"/>
+          </w:tcPr>
+          <w:p>
+            <w:r>
+              <w:t>Permisos</w:t>
+            </w:r>
+          </w:p>
+        </w:tc>
+        <w:tc>
+          <w:tcPr>
+            <w:tcW w:type="dxa" w:w="2880"/>
+          </w:tcPr>
+          <w:p>
+            <w:r>
+              <w:t>Motivo</w:t>
+            </w:r>
+          </w:p>
+        </w:tc>
+      </w:tr>
+      <w:tr>
+        <w:tc>
+          <w:tcPr>
+            <w:tcW w:type="dxa" w:w="2880"/>
+          </w:tcPr>
+          <w:p>
+            <w:r>
+              <w:t>/API/images/productos/</w:t>
+            </w:r>
+          </w:p>
+        </w:tc>
+        <w:tc>
+          <w:tcPr>
+            <w:tcW w:type="dxa" w:w="2880"/>
+          </w:tcPr>
+          <w:p>
+            <w:r>
+              <w:t>775 (rwxrwxr-x)</w:t>
+            </w:r>
+          </w:p>
+        </w:tc>
+        <w:tc>
+          <w:tcPr>
+            <w:tcW w:type="dxa" w:w="2880"/>
+          </w:tcPr>
+          <w:p>
+            <w:r>
+              <w:t>Permitir subida de imágenes desde la app</w:t>
+            </w:r>
+          </w:p>
+        </w:tc>
+      </w:tr>
+      <w:tr>
+        <w:tc>
+          <w:tcPr>
+            <w:tcW w:type="dxa" w:w="2880"/>
+          </w:tcPr>
+          <w:p>
+            <w:r>
+              <w:t>/API/</w:t>
+            </w:r>
+          </w:p>
+        </w:tc>
+        <w:tc>
+          <w:tcPr>
+            <w:tcW w:type="dxa" w:w="2880"/>
+          </w:tcPr>
+          <w:p>
+            <w:r>
+              <w:t>755 (rwxr-xr-x)</w:t>
+            </w:r>
+          </w:p>
+        </w:tc>
+        <w:tc>
+          <w:tcPr>
+            <w:tcW w:type="dxa" w:w="2880"/>
+          </w:tcPr>
+          <w:p>
+            <w:r>
+              <w:t>Permitir lectura de archivos estáticos</w:t>
+            </w:r>
+          </w:p>
+        </w:tc>
+      </w:tr>
+    </w:tbl>
+    <w:p>
+      <w:r>
+        <w:t>Los permisos se configuran desde FileZilla: botón derecho sobre la carpeta → "Permisos de archivo..." → marcar permisos y marcar "Recurse into subdirectories" → "Apply to all files and directories".</w:t>
+        <w:br/>
+        <w:br/>
+        <w:t>Sin estos permisos, la subida de imágenes desde el panel de administración fallaría por falta de permisos de escritura.</w:t>
+      </w:r>
+    </w:p>
+    <w:p>
+      <w:r>
+        <w:br w:type="page"/>
+      </w:r>
+    </w:p>
+    <w:p>
+      <w:pPr>
+        <w:pStyle w:val="Heading1"/>
+      </w:pPr>
+      <w:r>
+        <w:t>13. Extensión mbstring de PHP</w:t>
+      </w:r>
+    </w:p>
+    <w:p>
+      <w:r>
+        <w:t>Durante el despliegue se detectó que el servidor de Arsys no tenía instalada la extensión mbstring de PHP, lo que provocaba un error al usar la función mb_strtolower().</w:t>
+      </w:r>
+    </w:p>
+    <w:p>
+      <w:pPr>
+        <w:pStyle w:val="Heading2"/>
+      </w:pPr>
+      <w:r>
+        <w:t>Solución:</w:t>
+      </w:r>
+    </w:p>
+    <w:p>
+      <w:r>
+        <w:t>Se reemplazó mb_strtolower() por strtolower() en el código PHP, ya que la aplicación no necesita manejo de caracteres multibyte para su funcionamiento.</w:t>
+        <w:br/>
+        <w:br/>
+        <w:t>Si en el futuro se necesitara mbstring (por ejemplo, para caracteres acentuados), habría que solicitarlo en el panel de control de Arsys o cambiarse a un plan que lo incluya.</w:t>
+      </w:r>
+    </w:p>
+    <w:p>
+      <w:r>
+        <w:br w:type="page"/>
+      </w:r>
+    </w:p>
+    <w:p>
+      <w:pPr>
+        <w:pStyle w:val="Heading1"/>
+      </w:pPr>
+      <w:r>
+        <w:t>14. Registro de errores durante el despliegue</w:t>
+      </w:r>
+    </w:p>
+    <w:p>
+      <w:r>
+        <w:t>A continuación se enumeran todos los errores encontrados durante el proceso de despliegue y su solución:</w:t>
+      </w:r>
+    </w:p>
+    <w:tbl>
+      <w:tblPr>
+        <w:tblStyle w:val="LightShading-Accent1"/>
+        <w:tblW w:type="auto" w:w="0"/>
+        <w:jc w:val="center"/>
+        <w:tblLook w:firstColumn="1" w:firstRow="1" w:lastColumn="0" w:lastRow="0" w:noHBand="0" w:noVBand="1" w:val="04A0"/>
+      </w:tblPr>
+      <w:tblGrid>
+        <w:gridCol w:w="2880"/>
+        <w:gridCol w:w="2880"/>
+        <w:gridCol w:w="2880"/>
+      </w:tblGrid>
+      <w:tr>
+        <w:tc>
+          <w:tcPr>
+            <w:tcW w:type="dxa" w:w="2880"/>
+          </w:tcPr>
+          <w:p>
+            <w:r>
+              <w:t>Error</w:t>
+            </w:r>
+          </w:p>
+        </w:tc>
+        <w:tc>
+          <w:tcPr>
+            <w:tcW w:type="dxa" w:w="2880"/>
+          </w:tcPr>
+          <w:p>
+            <w:r>
+              <w:t>Síntoma</w:t>
+            </w:r>
+          </w:p>
+        </w:tc>
+        <w:tc>
+          <w:tcPr>
+            <w:tcW w:type="dxa" w:w="2880"/>
+          </w:tcPr>
+          <w:p>
+            <w:r>
+              <w:t>Solución</w:t>
+            </w:r>
+          </w:p>
+        </w:tc>
+      </w:tr>
+      <w:tr>
+        <w:tc>
+          <w:tcPr>
+            <w:tcW w:type="dxa" w:w="2880"/>
+          </w:tcPr>
+          <w:p>
+            <w:r>
+              <w:t>Error 1: API no responde (404)</w:t>
+            </w:r>
+          </w:p>
+        </w:tc>
+        <w:tc>
+          <w:tcPr>
+            <w:tcW w:type="dxa" w:w="2880"/>
+          </w:tcPr>
+          <w:p>
+            <w:r>
+              <w:t>Al acceder a https://chomsky.es/API/api/login, el servidor devolvía 404.</w:t>
+            </w:r>
+          </w:p>
+        </w:tc>
+        <w:tc>
+          <w:tcPr>
+            <w:tcW w:type="dxa" w:w="2880"/>
+          </w:tcPr>
+          <w:p>
+            <w:r>
+              <w:t>El api/index.php esperaba que el primer segmento de la ruta fuera "api" (minúsculas), pero desde la subcarpeta /API/ el primer segmento era "API" (mayúsculas). Se añadió case "API": y lógica de normalización de rutas.</w:t>
+            </w:r>
+          </w:p>
+        </w:tc>
+      </w:tr>
+      <w:tr>
+        <w:tc>
+          <w:tcPr>
+            <w:tcW w:type="dxa" w:w="2880"/>
+          </w:tcPr>
+          <w:p>
+            <w:r>
+              <w:t>Error 2: Imágenes de productos no se ven</w:t>
+            </w:r>
+          </w:p>
+        </w:tc>
+        <w:tc>
+          <w:tcPr>
+            <w:tcW w:type="dxa" w:w="2880"/>
+          </w:tcPr>
+          <w:p>
+            <w:r>
+              <w:t>Las imágenes de productos no se cargaban en el panel de administración.</w:t>
+            </w:r>
+          </w:p>
+        </w:tc>
+        <w:tc>
+          <w:tcPr>
+            <w:tcW w:type="dxa" w:w="2880"/>
+          </w:tcPr>
+          <w:p>
+            <w:r>
+              <w:t>La función getImagenUrl() generaba URLs absolutas (/images/productos/...) pero la app está en /API/. Se cambió a ruta relativa (images/productos/...).</w:t>
+            </w:r>
+          </w:p>
+        </w:tc>
+      </w:tr>
+      <w:tr>
+        <w:tc>
+          <w:tcPr>
+            <w:tcW w:type="dxa" w:w="2880"/>
+          </w:tcPr>
+          <w:p>
+            <w:r>
+              <w:t>Error 3: Error al subir imágenes</w:t>
+            </w:r>
+          </w:p>
+        </w:tc>
+        <w:tc>
+          <w:tcPr>
+            <w:tcW w:type="dxa" w:w="2880"/>
+          </w:tcPr>
+          <w:p>
+            <w:r>
+              <w:t>Al subir una imagen desde la app, se guardaba en una ruta incorrecta.</w:t>
+            </w:r>
+          </w:p>
+        </w:tc>
+        <w:tc>
+          <w:tcPr>
+            <w:tcW w:type="dxa" w:w="2880"/>
+          </w:tcPr>
+          <w:p>
+            <w:r>
+              <w:t>La ruta de subida en api/index.php apuntaba a la estructura de desarrollo local (FitStock-APP/public/...). Se cambió a la ruta relativa del servidor.</w:t>
+            </w:r>
+          </w:p>
+        </w:tc>
+      </w:tr>
+      <w:tr>
+        <w:tc>
+          <w:tcPr>
+            <w:tcW w:type="dxa" w:w="2880"/>
+          </w:tcPr>
+          <w:p>
+            <w:r>
+              <w:t>Error 4: Página en blanco al refrescar</w:t>
+            </w:r>
+          </w:p>
+        </w:tc>
+        <w:tc>
+          <w:tcPr>
+            <w:tcW w:type="dxa" w:w="2880"/>
+          </w:tcPr>
+          <w:p>
+            <w:r>
+              <w:t>Al recargar cualquier ruta de Angular (F5), aparecía página en blanco o 404.</w:t>
+            </w:r>
+          </w:p>
+        </w:tc>
+        <w:tc>
+          <w:tcPr>
+            <w:tcW w:type="dxa" w:w="2880"/>
+          </w:tcPr>
+          <w:p>
+            <w:r>
+              <w:t>Faltaba la directiva RewriteBase /API/ en el .htaccess. Se añadió para que Apache resuelva correctamente las rutas relativas desde la subcarpeta.</w:t>
+            </w:r>
+          </w:p>
+        </w:tc>
+      </w:tr>
+      <w:tr>
+        <w:tc>
+          <w:tcPr>
+            <w:tcW w:type="dxa" w:w="2880"/>
+          </w:tcPr>
+          <w:p>
+            <w:r>
+              <w:t>Error 5: Estilos de documentación rotos</w:t>
+            </w:r>
+          </w:p>
+        </w:tc>
+        <w:tc>
+          <w:tcPr>
+            <w:tcW w:type="dxa" w:w="2880"/>
+          </w:tcPr>
+          <w:p>
+            <w:r>
+              <w:t>Los estilos CSS de la página de documentación no se cargaban correctamente.</w:t>
+            </w:r>
+          </w:p>
+        </w:tc>
+        <w:tc>
+          <w:tcPr>
+            <w:tcW w:type="dxa" w:w="2880"/>
+          </w:tcPr>
+          <w:p>
+            <w:r>
+              <w:t>Las rutas relativas del CSS se rompían en la subcarpeta. Se cambió a CSS inline con file_get_contents().</w:t>
+            </w:r>
+          </w:p>
+        </w:tc>
+      </w:tr>
+      <w:tr>
+        <w:tc>
+          <w:tcPr>
+            <w:tcW w:type="dxa" w:w="2880"/>
+          </w:tcPr>
+          <w:p>
+            <w:r>
+              <w:t>Error 6: mb_strtolower() no existe</w:t>
+            </w:r>
+          </w:p>
+        </w:tc>
+        <w:tc>
+          <w:tcPr>
+            <w:tcW w:type="dxa" w:w="2880"/>
+          </w:tcPr>
+          <w:p>
+            <w:r>
+              <w:t>Error PHP: "Call to undefined function mb_strtolower()".</w:t>
+            </w:r>
+          </w:p>
+        </w:tc>
+        <w:tc>
+          <w:tcPr>
+            <w:tcW w:type="dxa" w:w="2880"/>
+          </w:tcPr>
+          <w:p>
+            <w:r>
+              <w:t>La extensión mbstring no está instalada en Arsys. Se reemplazó por strtolower() estándar.</w:t>
+            </w:r>
+          </w:p>
+        </w:tc>
+      </w:tr>
+      <w:tr>
+        <w:tc>
+          <w:tcPr>
+            <w:tcW w:type="dxa" w:w="2880"/>
+          </w:tcPr>
+          <w:p>
+            <w:r>
+              <w:t>Error 7: CORS bloqueado</w:t>
+            </w:r>
+          </w:p>
+        </w:tc>
+        <w:tc>
+          <w:tcPr>
+            <w:tcW w:type="dxa" w:w="2880"/>
+          </w:tcPr>
+          <w:p>
+            <w:r>
+              <w:t>El navegador bloqueaba las peticiones a la API por CORS.</w:t>
+            </w:r>
+          </w:p>
+        </w:tc>
+        <w:tc>
+          <w:tcPr>
+            <w:tcW w:type="dxa" w:w="2880"/>
+          </w:tcPr>
+          <w:p>
+            <w:r>
+              <w:t>Se actualizó la cabecera Access-Control-Allow-Origin en router.php de http://localhost:4200 a https://chomsky.es.</w:t>
+            </w:r>
+          </w:p>
+        </w:tc>
+      </w:tr>
+      <w:tr>
+        <w:tc>
+          <w:tcPr>
+            <w:tcW w:type="dxa" w:w="2880"/>
+          </w:tcPr>
+          <w:p>
+            <w:r>
+              <w:t>Error 8: Sin datos en la aplicación</w:t>
+            </w:r>
+          </w:p>
+        </w:tc>
+        <w:tc>
+          <w:tcPr>
+            <w:tcW w:type="dxa" w:w="2880"/>
+          </w:tcPr>
+          <w:p>
+            <w:r>
+              <w:t>La app cargaba pero no mostraba productos, materiales ni incidencias.</w:t>
+            </w:r>
+          </w:p>
+        </w:tc>
+        <w:tc>
+          <w:tcPr>
+            <w:tcW w:type="dxa" w:w="2880"/>
+          </w:tcPr>
+          <w:p>
+            <w:r>
+              <w:t>La base de datos solo tenía usuarios. Se añadieron los INSERT con datos de ejemplo al archivo databasearsys.sql.</w:t>
+            </w:r>
+          </w:p>
+        </w:tc>
+      </w:tr>
+    </w:tbl>
+    <w:p>
+      <w:pPr>
+        <w:pStyle w:val="Heading2"/>
+      </w:pPr>
+      <w:r>
+        <w:t>Resumen de errores por archivo:</w:t>
+      </w:r>
+    </w:p>
+    <w:tbl>
+      <w:tblPr>
+        <w:tblStyle w:val="LightShading-Accent1"/>
+        <w:tblW w:type="auto" w:w="0"/>
+        <w:jc w:val="center"/>
+        <w:tblLook w:firstColumn="1" w:firstRow="1" w:lastColumn="0" w:lastRow="0" w:noHBand="0" w:noVBand="1" w:val="04A0"/>
+      </w:tblPr>
+      <w:tblGrid>
+        <w:gridCol w:w="4320"/>
+        <w:gridCol w:w="4320"/>
+      </w:tblGrid>
+      <w:tr>
+        <w:tc>
+          <w:tcPr>
+            <w:tcW w:type="dxa" w:w="4320"/>
+          </w:tcPr>
+          <w:p>
+            <w:r>
+              <w:t>Archivo modificado</w:t>
+            </w:r>
+          </w:p>
+        </w:tc>
+        <w:tc>
+          <w:tcPr>
+            <w:tcW w:type="dxa" w:w="4320"/>
+          </w:tcPr>
+          <w:p>
+            <w:r>
+              <w:t>Errores que soluciona</w:t>
+            </w:r>
+          </w:p>
+        </w:tc>
+      </w:tr>
+      <w:tr>
+        <w:tc>
+          <w:tcPr>
+            <w:tcW w:type="dxa" w:w="4320"/>
+          </w:tcPr>
+          <w:p>
+            <w:r>
+              <w:t>FitStock-API/router.php</w:t>
+            </w:r>
+          </w:p>
+        </w:tc>
+        <w:tc>
+          <w:tcPr>
+            <w:tcW w:type="dxa" w:w="4320"/>
+          </w:tcPr>
+          <w:p>
+            <w:r>
+              <w:t>Error 1 (regex), Error 7 (CORS)</w:t>
+            </w:r>
+          </w:p>
+        </w:tc>
+      </w:tr>
+      <w:tr>
+        <w:tc>
+          <w:tcPr>
+            <w:tcW w:type="dxa" w:w="4320"/>
+          </w:tcPr>
+          <w:p>
+            <w:r>
+              <w:t>FitStock-API/api/index.php</w:t>
+            </w:r>
+          </w:p>
+        </w:tc>
+        <w:tc>
+          <w:tcPr>
+            <w:tcW w:type="dxa" w:w="4320"/>
+          </w:tcPr>
+          <w:p>
+            <w:r>
+              <w:t>Error 1 (case API), Error 3 (ruta subida)</w:t>
+            </w:r>
+          </w:p>
+        </w:tc>
+      </w:tr>
+      <w:tr>
+        <w:tc>
+          <w:tcPr>
+            <w:tcW w:type="dxa" w:w="4320"/>
+          </w:tcPr>
+          <w:p>
+            <w:r>
+              <w:t>FitStock-API/.htaccess</w:t>
+            </w:r>
+          </w:p>
+        </w:tc>
+        <w:tc>
+          <w:tcPr>
+            <w:tcW w:type="dxa" w:w="4320"/>
+          </w:tcPr>
+          <w:p>
+            <w:r>
+              <w:t>Error 4 (RewriteBase)</w:t>
+            </w:r>
+          </w:p>
+        </w:tc>
+      </w:tr>
+      <w:tr>
+        <w:tc>
+          <w:tcPr>
+            <w:tcW w:type="dxa" w:w="4320"/>
+          </w:tcPr>
+          <w:p>
+            <w:r>
+              <w:t>FitStock-API/docs/docs.php</w:t>
+            </w:r>
+          </w:p>
+        </w:tc>
+        <w:tc>
+          <w:tcPr>
+            <w:tcW w:type="dxa" w:w="4320"/>
+          </w:tcPr>
+          <w:p>
+            <w:r>
+              <w:t>Error 5 (CSS inline)</w:t>
+            </w:r>
+          </w:p>
+        </w:tc>
+      </w:tr>
+      <w:tr>
+        <w:tc>
+          <w:tcPr>
+            <w:tcW w:type="dxa" w:w="4320"/>
+          </w:tcPr>
+          <w:p>
+            <w:r>
+              <w:t>FitStock-API/conexion.php</w:t>
+            </w:r>
+          </w:p>
+        </w:tc>
+        <w:tc>
+          <w:tcPr>
+            <w:tcW w:type="dxa" w:w="4320"/>
+          </w:tcPr>
+          <w:p>
+            <w:r>
+              <w:t>Credenciales producción</w:t>
+            </w:r>
+          </w:p>
+        </w:tc>
+      </w:tr>
+      <w:tr>
+        <w:tc>
+          <w:tcPr>
+            <w:tcW w:type="dxa" w:w="4320"/>
+          </w:tcPr>
+          <w:p>
+            <w:r>
+              <w:t>FitStock-APP/src/.../producto-list.ts</w:t>
+            </w:r>
+          </w:p>
+        </w:tc>
+        <w:tc>
+          <w:tcPr>
+            <w:tcW w:type="dxa" w:w="4320"/>
+          </w:tcPr>
+          <w:p>
+            <w:r>
+              <w:t>Error 2 (URL imágenes)</w:t>
+            </w:r>
+          </w:p>
+        </w:tc>
+      </w:tr>
+      <w:tr>
+        <w:tc>
+          <w:tcPr>
+            <w:tcW w:type="dxa" w:w="4320"/>
+          </w:tcPr>
+          <w:p>
+            <w:r>
+              <w:t>FitStock-APP/src/.../services/*.ts</w:t>
+            </w:r>
+          </w:p>
+        </w:tc>
+        <w:tc>
+          <w:tcPr>
+            <w:tcW w:type="dxa" w:w="4320"/>
+          </w:tcPr>
+          <w:p>
+            <w:r>
+              <w:t>Error 7 (URL API)</w:t>
+            </w:r>
+          </w:p>
+        </w:tc>
+      </w:tr>
+      <w:tr>
+        <w:tc>
+          <w:tcPr>
+            <w:tcW w:type="dxa" w:w="4320"/>
+          </w:tcPr>
+          <w:p>
+            <w:r>
+              <w:t>FitStock-API/config/databasearsys.sql</w:t>
+            </w:r>
+          </w:p>
+        </w:tc>
+        <w:tc>
+          <w:tcPr>
+            <w:tcW w:type="dxa" w:w="4320"/>
+          </w:tcPr>
+          <w:p>
+            <w:r>
+              <w:t>Error 8 (datos ejemplo)</w:t>
+            </w:r>
+          </w:p>
+        </w:tc>
+      </w:tr>
+    </w:tbl>
+    <w:p>
+      <w:r>
+        <w:br w:type="page"/>
+      </w:r>
+    </w:p>
+    <w:p>
+      <w:pPr>
+        <w:pStyle w:val="Heading1"/>
+      </w:pPr>
+      <w:r>
+        <w:t>15. Archivos a subir por FTP</w:t>
       </w:r>
     </w:p>
     <w:p>
@@ -1123,7 +2461,7 @@
         <w:pStyle w:val="Heading1"/>
       </w:pPr>
       <w:r>
-        <w:t>10. Estructura final del servidor</w:t>
+        <w:t>16. Estructura final del servidor</w:t>
       </w:r>
     </w:p>
     <w:p>
@@ -1173,6 +2511,134 @@
         <w:t xml:space="preserve">    ├── docs/                  # Documentación</w:t>
         <w:br/>
         <w:t xml:space="preserve">    └── models/                # Modelos de datos</w:t>
+      </w:r>
+    </w:p>
+    <w:p>
+      <w:r>
+        <w:br w:type="page"/>
+      </w:r>
+    </w:p>
+    <w:p>
+      <w:pPr>
+        <w:pStyle w:val="Heading1"/>
+      </w:pPr>
+      <w:r>
+        <w:t>17. Verificación post-despliegue</w:t>
+      </w:r>
+    </w:p>
+    <w:p>
+      <w:r>
+        <w:t>Una vez subidos todos los archivos y configurada la base de datos, se recomienda seguir esta checklist para verificar que todo funciona correctamente:</w:t>
+      </w:r>
+    </w:p>
+    <w:p>
+      <w:pPr>
+        <w:pStyle w:val="ListBullet"/>
+      </w:pPr>
+      <w:r>
+        <w:t>1. Acceder a https://chomsky.es/API/ y comprobar que se carga la página de inicio</w:t>
+      </w:r>
+    </w:p>
+    <w:p>
+      <w:pPr>
+        <w:pStyle w:val="ListBullet"/>
+      </w:pPr>
+      <w:r>
+        <w:t>2. Probar el registro de un nuevo usuario</w:t>
+      </w:r>
+    </w:p>
+    <w:p>
+      <w:pPr>
+        <w:pStyle w:val="ListBullet"/>
+      </w:pPr>
+      <w:r>
+        <w:t>3. Iniciar sesión con admin@fitstock.com (o el usuario creado)</w:t>
+      </w:r>
+    </w:p>
+    <w:p>
+      <w:pPr>
+        <w:pStyle w:val="ListBullet"/>
+      </w:pPr>
+      <w:r>
+        <w:t>4. Verificar que el dashboard de administración carga los datos del resumen</w:t>
+      </w:r>
+    </w:p>
+    <w:p>
+      <w:pPr>
+        <w:pStyle w:val="ListBullet"/>
+      </w:pPr>
+      <w:r>
+        <w:t>5. Comprobar que la lista de productos se muestra correctamente (incluyendo imágenes)</w:t>
+      </w:r>
+    </w:p>
+    <w:p>
+      <w:pPr>
+        <w:pStyle w:val="ListBullet"/>
+      </w:pPr>
+      <w:r>
+        <w:t>6. Probar a crear, editar y eliminar un producto</w:t>
+      </w:r>
+    </w:p>
+    <w:p>
+      <w:pPr>
+        <w:pStyle w:val="ListBullet"/>
+      </w:pPr>
+      <w:r>
+        <w:t>7. Comprobar que los materiales (máquinas y prestables) se listan correctamente</w:t>
+      </w:r>
+    </w:p>
+    <w:p>
+      <w:pPr>
+        <w:pStyle w:val="ListBullet"/>
+      </w:pPr>
+      <w:r>
+        <w:t>8. Verificar que los préstamos funcionan (crear, devolver, eliminar)</w:t>
+      </w:r>
+    </w:p>
+    <w:p>
+      <w:pPr>
+        <w:pStyle w:val="ListBullet"/>
+      </w:pPr>
+      <w:r>
+        <w:t>9. Probar el sistema de incidencias (crear, cambiar estado, resolver)</w:t>
+      </w:r>
+    </w:p>
+    <w:p>
+      <w:pPr>
+        <w:pStyle w:val="ListBullet"/>
+      </w:pPr>
+      <w:r>
+        <w:t>10. Probar la subida de una imagen de producto</w:t>
+      </w:r>
+    </w:p>
+    <w:p>
+      <w:pPr>
+        <w:pStyle w:val="ListBullet"/>
+      </w:pPr>
+      <w:r>
+        <w:t>11. Refrescar (F5) en varias rutas: /API/, /API/login, /API/admin/inventario</w:t>
+      </w:r>
+    </w:p>
+    <w:p>
+      <w:pPr>
+        <w:pStyle w:val="ListBullet"/>
+      </w:pPr>
+      <w:r>
+        <w:t>12. Verificar que la documentación en /API/docs/docs.php se ve correctamente</w:t>
+      </w:r>
+    </w:p>
+    <w:p>
+      <w:pPr>
+        <w:pStyle w:val="ListBullet"/>
+      </w:pPr>
+      <w:r>
+        <w:t>13. Cerrar sesión y verificar que se redirige correctamente</w:t>
+      </w:r>
+    </w:p>
+    <w:p/>
+    <w:p>
+      <w:r>
+        <w:t>Si todos los puntos funcionan, el despliegue se ha completado con éxito.</w:t>
       </w:r>
     </w:p>
     <w:sectPr>

</xml_diff>